<commit_message>
Roman reels: add '5 channels' topic with platform chat inserts, updated scripts with reference reels
Co-Authored-By: Claude Opus 5.5 <noreply@anthropic.com>
Claude-Session: https://claude.ai/code/session_012XK78gBCYLJFULW6X1fJk1
</commit_message>
<xml_diff>
--- a/roman-reels/docs/Roman-scenarii-na-soglasovanie.docx
+++ b/roman-reels/docs/Roman-scenarii-na-soglasovanie.docx
@@ -7,7 +7,7 @@
         <w:pStyle w:val="Title"/>
       </w:pPr>
       <w:r>
-        <w:t>Сценарии рилсов на согласование</w:t>
+        <w:t>Сценарии рилсов</w:t>
       </w:r>
     </w:p>
     <w:p>
@@ -16,7 +16,7 @@
           <w:b w:val="0"/>
           <w:i/>
         </w:rPr>
-        <w:t>Роман, ниже хуки и основной текст двух рилсов. Обращение на «ты», в конце — твой призыв к комментариям.</w:t>
+        <w:t>Роман, ниже хуки и основной текст двух рилсов и ссылки на рилсы-референсы, на которые опирались.</w:t>
       </w:r>
     </w:p>
     <w:p>
@@ -24,7 +24,7 @@
         <w:pStyle w:val="Heading1"/>
       </w:pPr>
       <w:r>
-        <w:t>Рилс 1. Нейросеть отвечает клиентам: 3 уровня</w:t>
+        <w:t>Рилс 1. 5 мест, где переписку с клиентами уже ведёт нейросеть</w:t>
       </w:r>
     </w:p>
     <w:p>
@@ -41,7 +41,7 @@
         <w:pStyle w:val="Heading2"/>
       </w:pPr>
       <w:r>
-        <w:t>Хуки (первые 5–7 секунд, 3 варианта для теста)</w:t>
+        <w:t>Хуки (3 варианта для теста)</w:t>
       </w:r>
     </w:p>
     <w:p>
@@ -50,7 +50,7 @@
           <w:b w:val="0"/>
           <w:i w:val="0"/>
         </w:rPr>
-        <w:t>Хук 1: Пока ты отвечаешь клиенту через три часа, он уже пишет конкуренту. Покажу, как нейросеть отвечает за секунды — и без ошибок.</w:t>
+        <w:t>Хук 1: Переписку с клиентами уже можно отдать нейросети в пяти местах. Про последнее почти никто не знает.</w:t>
       </w:r>
     </w:p>
     <w:p>
@@ -59,7 +59,7 @@
           <w:b w:val="0"/>
           <w:i w:val="0"/>
         </w:rPr>
-        <w:t>Хук 2: Ответ в течение часа — и шанс дойти до сделки в семь раз выше. Вот как этого добиться, даже если ты один.</w:t>
+        <w:t>Хук 2: Ты всё ещё сам отвечаешь клиентам в WhatsApp, Instagram и на Авито? Вот где это уже делает нейросеть.</w:t>
       </w:r>
     </w:p>
     <w:p>
@@ -68,7 +68,7 @@
           <w:b w:val="0"/>
           <w:i w:val="0"/>
         </w:rPr>
-        <w:t>Хук 3: Есть три уровня, как нейросеть может отвечать твоим клиентам. Большинство застревает на первом.</w:t>
+        <w:t>Хук 3: WhatsApp, Instagram, Авито, Wildberries, Telegram — в каждом из них нейросеть уже может отвечать твоим клиентам. Показываю где и как.</w:t>
       </w:r>
     </w:p>
     <w:p>
@@ -85,7 +85,7 @@
           <w:b w:val="0"/>
           <w:i w:val="0"/>
         </w:rPr>
-        <w:t>Harvard Business Review выяснил: если ответить на заявку в течение часа, шанс довести клиента до разговора примерно в семь раз выше, чем если ответить позже. Нейросеть помогает отвечать за секунды — и тут есть три уровня.</w:t>
+        <w:t>Первое — WhatsApp. В сентябре Meta выпустила официальный коннектор для Claude: он сам подключает номер к WhatsApp Business API, настраивает шаблоны сообщений и проверяет, что всё работает. Раньше для этого нанимали разработчика.</w:t>
       </w:r>
     </w:p>
     <w:p>
@@ -94,7 +94,7 @@
           <w:b w:val="0"/>
           <w:i w:val="0"/>
         </w:rPr>
-        <w:t>Уровень первый: копируешь сообщение клиента в Claude или ChatGPT и просишь ответ. Это уже быстрее, чем писать самому. Но без твоих цен и сроков он напишет: «подставьте сумму».</w:t>
+        <w:t>Второе — Instagram. Связка ManyChat и ChatGPT: человек пишет слово в комментариях — и бот сам отвечает ему в директ, присылает ссылку и отвечает на вопросы о цене.</w:t>
       </w:r>
     </w:p>
     <w:p>
@@ -103,7 +103,7 @@
           <w:b w:val="0"/>
           <w:i w:val="0"/>
         </w:rPr>
-        <w:t>Поэтому уровень второй — база знаний. Один раз собери в проект Claude или свой GPT: цены, сроки, доставку, оплату, частые вопросы и пару своих ответов как образец стиля. Теперь ответ готов сразу — с твоими цифрами и твоими словами.</w:t>
+        <w:t>Третье — Авито. У Авито есть API мессенджера, и бот с нейросетью отвечает покупателям: наличие, доставка, цена. А готовую заявку сразу присылает тебе.</w:t>
       </w:r>
     </w:p>
     <w:p>
@@ -112,7 +112,7 @@
           <w:b w:val="0"/>
           <w:i w:val="0"/>
         </w:rPr>
-        <w:t>Уровень третий — бот, который отвечает сам: в директе, Телеграме, на сайте. Типовые вопросы он закрывает, а жалобы, возвраты и крупные заказы передаёт тебе. А для звонков уже есть голосовые роботы — клиент порой даже не понимает, что говорит с ИИ.</w:t>
+        <w:t>Четвёртое — Wildberries. Там уже есть встроенная нейросеть, которая отвечает на отзывы. Можно включить автоответы только на четыре и пять звёзд, а сложные отзывы оставить себе.</w:t>
       </w:r>
     </w:p>
     <w:p>
@@ -121,7 +121,7 @@
           <w:b w:val="0"/>
           <w:i w:val="0"/>
         </w:rPr>
-        <w:t>И фишка, о которой забывают, — напоминания. Клиент спросил цену и пропал? Попроси нейросеть написать мягкое сообщение через день. Часть таких клиентов возвращается.</w:t>
+        <w:t>И пятое — Telegram. В Telegram Business бота можно подключить прямо к своему аккаунту — и он отвечает клиентам от твоего имени, в твоём же чате.</w:t>
       </w:r>
     </w:p>
     <w:p>
@@ -130,7 +130,7 @@
           <w:b w:val="0"/>
           <w:i w:val="0"/>
         </w:rPr>
-        <w:t>Главное правило: на старте нейросеть пишет, а ты проверяешь и отправляешь.</w:t>
+        <w:t>Главное правило везде одно: нейросеть отвечает на типовые вопросы, а жалобы и крупные заказы передаёт тебе.</w:t>
       </w:r>
     </w:p>
     <w:p>
@@ -139,7 +139,81 @@
           <w:b w:val="0"/>
           <w:i w:val="0"/>
         </w:rPr>
-        <w:t>Напиши в комментариях, где ты общаешься со своими клиентами, — и в следующем видео я разберу это подробнее.</w:t>
+        <w:t>Напиши в комментариях, где тебе автоматизировать переписку: WhatsApp, Instagram, Авито, Wildberries или Telegram, — и следующее видео я сниму именно про это.</w:t>
+      </w:r>
+    </w:p>
+    <w:p>
+      <w:pPr>
+        <w:pStyle w:val="Heading2"/>
+      </w:pPr>
+      <w:r>
+        <w:t>Референсы — залетевшие рилсы по теме</w:t>
+      </w:r>
+    </w:p>
+    <w:p>
+      <w:pPr>
+        <w:pStyle w:val="ListBullet"/>
+      </w:pPr>
+      <w:r>
+        <w:t>WhatsApp: Claude + официальный WhatsApp Business MCP (@erickcastilio.ia) — https://www.instagram.com/reel/Ddt5T--xm2k/</w:t>
+      </w:r>
+    </w:p>
+    <w:p>
+      <w:pPr>
+        <w:pStyle w:val="ListBullet"/>
+      </w:pPr>
+      <w:r>
+        <w:t>WhatsApp за 5 минут через Claude (@aiwithanushka) — https://www.instagram.com/reel/DdMMPYUzvcK/</w:t>
+      </w:r>
+    </w:p>
+    <w:p>
+      <w:pPr>
+        <w:pStyle w:val="ListBullet"/>
+      </w:pPr>
+      <w:r>
+        <w:t>Instagram: ChatGPT + ManyChat, ответы в директ (@mavgpt) — https://www.instagram.com/reel/Dc3h-JKKFyC/</w:t>
+      </w:r>
+    </w:p>
+    <w:p>
+      <w:pPr>
+        <w:pStyle w:val="ListBullet"/>
+      </w:pPr>
+      <w:r>
+        <w:t>Instagram: Claude + ManyChat (@askcatgpt) — https://www.instagram.com/reel/DYTE2YSC1TR/</w:t>
+      </w:r>
+    </w:p>
+    <w:p>
+      <w:pPr>
+        <w:pStyle w:val="ListBullet"/>
+      </w:pPr>
+      <w:r>
+        <w:t>Салон красоты: ассистент ChatGPT для записи и оплаты (@debiichris) — https://www.instagram.com/reel/DYP3hPSsqvV/</w:t>
+      </w:r>
+    </w:p>
+    <w:p>
+      <w:pPr>
+        <w:pStyle w:val="ListBullet"/>
+      </w:pPr>
+      <w:r>
+        <w:t>Формат «5 инструментов» — 286 тыс. просмотров (@anna_freydina) — https://www.instagram.com/reel/DahV1ehhJaF/</w:t>
+      </w:r>
+    </w:p>
+    <w:p>
+      <w:pPr>
+        <w:pStyle w:val="ListBullet"/>
+      </w:pPr>
+      <w:r>
+        <w:t>ИИ-менеджер звонит клиентам — 343 тыс. (@donat_sellergpt) — https://www.instagram.com/reel/DbnvWe5sDuP/</w:t>
+      </w:r>
+    </w:p>
+    <w:p>
+      <w:r>
+        <w:rPr>
+          <w:b w:val="0"/>
+          <w:i/>
+          <w:color w:val="6E6E6E"/>
+        </w:rPr>
+        <w:t>Факты проверены: WhatsApp Business MCP от Meta (бета, сентябрь 2026), API мессенджера Авито, встроенные ИИ-ответы на отзывы Wildberries, подключение ботов в Telegram Business. Цифры лайков у первых референсов — по данным Meta AI, мы их не перепроверяли.</w:t>
       </w:r>
     </w:p>
     <w:p>
@@ -164,7 +238,7 @@
         <w:pStyle w:val="Heading2"/>
       </w:pPr>
       <w:r>
-        <w:t>Хуки (первые 5–7 секунд, 3 варианта для теста)</w:t>
+        <w:t>Хуки (3 варианта для теста)</w:t>
       </w:r>
     </w:p>
     <w:p>
@@ -254,6 +328,38 @@
           <w:i w:val="0"/>
         </w:rPr>
         <w:t>Напиши в комментариях, какой у тебя продукт, — и в следующем видео я разберу, как описать его в заявке.</w:t>
+      </w:r>
+    </w:p>
+    <w:p>
+      <w:pPr>
+        <w:pStyle w:val="Heading2"/>
+      </w:pPr>
+      <w:r>
+        <w:t>Референсы — залетевшие рилсы по теме</w:t>
+      </w:r>
+    </w:p>
+    <w:p>
+      <w:pPr>
+        <w:pStyle w:val="ListBullet"/>
+      </w:pPr>
+      <w:r>
+        <w:t>Исходный рилс по теме (@itmaxxer, TikTok) — https://www.tiktok.com/@itmaxxer/video/7693927761303325984</w:t>
+      </w:r>
+    </w:p>
+    <w:p>
+      <w:pPr>
+        <w:pStyle w:val="ListBullet"/>
+      </w:pPr>
+      <w:r>
+        <w:t>Официальная страница программы — https://claude.com/programs/startups</w:t>
+      </w:r>
+    </w:p>
+    <w:p>
+      <w:pPr>
+        <w:pStyle w:val="ListBullet"/>
+      </w:pPr>
+      <w:r>
+        <w:t>CNBC о запуске программы — https://www.cnbc.com/2026/10/06/anthropic-claude-startups-program.html</w:t>
       </w:r>
     </w:p>
     <w:sectPr>

</xml_diff>

<commit_message>
Roman reels: fact-checked '5 channels' script, WB via official feedbacks API, WhatsApp Russia caveat
Co-Authored-By: Claude Opus 5.5 <noreply@anthropic.com>
Claude-Session: https://claude.ai/code/session_012XK78gBCYLJFULW6X1fJk1
</commit_message>
<xml_diff>
--- a/roman-reels/docs/Roman-scenarii-na-soglasovanie.docx
+++ b/roman-reels/docs/Roman-scenarii-na-soglasovanie.docx
@@ -33,7 +33,7 @@
           <w:b w:val="0"/>
           <w:i/>
         </w:rPr>
-        <w:t>Длительность: ≈ 1 мин 25 с</w:t>
+        <w:t>Длительность: ≈ 1 мин 35 с</w:t>
       </w:r>
     </w:p>
     <w:p>
@@ -85,7 +85,7 @@
           <w:b w:val="0"/>
           <w:i w:val="0"/>
         </w:rPr>
-        <w:t>Первое — WhatsApp. В сентябре Meta выпустила официальный коннектор для Claude: он сам подключает номер к WhatsApp Business API, настраивает шаблоны сообщений и проверяет, что всё работает. Раньше для этого нанимали разработчика.</w:t>
+        <w:t>Первое — WhatsApp. Сразу оговорка: в России он сейчас заблокирован, так что это для тех, у кого клиенты в других странах. В сентябре Meta выпустила официальный MCP-сервер, пока в бета-версии: через него Claude сам подключает номер к WhatsApp Business API, настраивает шаблоны сообщений и проверяет, что всё работает. Раньше для этого нанимали разработчика.</w:t>
       </w:r>
     </w:p>
     <w:p>
@@ -112,7 +112,7 @@
           <w:b w:val="0"/>
           <w:i w:val="0"/>
         </w:rPr>
-        <w:t>Четвёртое — Wildberries. Там уже есть встроенная нейросеть, которая отвечает на отзывы. Можно включить автоответы только на четыре и пять звёзд, а сложные отзывы оставить себе.</w:t>
+        <w:t>Четвёртое — Wildberries. У него есть официальный API вопросов и отзывов. Подключаешь к нему нейросеть — она сама читает новые отзывы и вопросы покупателей и публикует ответы. Можно настроить, чтобы автоматически уходили ответы на четыре и пять звёзд, а сложные отзывы приходили тебе на проверку.</w:t>
       </w:r>
     </w:p>
     <w:p>
@@ -213,7 +213,7 @@
           <w:i/>
           <w:color w:val="6E6E6E"/>
         </w:rPr>
-        <w:t>Факты проверены: WhatsApp Business MCP от Meta (бета, сентябрь 2026), API мессенджера Авито, встроенные ИИ-ответы на отзывы Wildberries, подключение ботов в Telegram Business. Цифры лайков у первых референсов — по данным Meta AI, мы их не перепроверяли.</w:t>
+        <w:t>Факты проверены 8 октября 2026: WhatsApp Business MCP от Meta (бета, с 15 сентября 2026); WhatsApp в России заблокирован с февраля 2026 (работает только через VPN); у Авито есть API с мессенджером и отзывами; у Wildberries — официальный API вопросов и отзывов (feedbacks-api, ответы публикуются методом /feedbacks/answer, токен действует 180 дней; при подозрительной активности WB может ограничить доступ к API); ManyChat — шаг с ChatGPT в сценариях по ключевому слову; Telegram Business — подключение бота к личному аккаунту. Цифры лайков у первых референсов — по данным Meta AI, мы их не перепроверяли.</w:t>
       </w:r>
     </w:p>
     <w:p>

</xml_diff>

<commit_message>
Roman reels: WB point now about buyer chat via API with platform rules
Co-Authored-By: Claude Opus 5.5 <noreply@anthropic.com>
Claude-Session: https://claude.ai/code/session_012XK78gBCYLJFULW6X1fJk1
</commit_message>
<xml_diff>
--- a/roman-reels/docs/Roman-scenarii-na-soglasovanie.docx
+++ b/roman-reels/docs/Roman-scenarii-na-soglasovanie.docx
@@ -33,7 +33,7 @@
           <w:b w:val="0"/>
           <w:i/>
         </w:rPr>
-        <w:t>Длительность: ≈ 1 мин 35 с</w:t>
+        <w:t>Длительность: ≈ 1 мин 40 с</w:t>
       </w:r>
     </w:p>
     <w:p>
@@ -112,7 +112,7 @@
           <w:b w:val="0"/>
           <w:i w:val="0"/>
         </w:rPr>
-        <w:t>Четвёртое — Wildberries. У него есть официальный API вопросов и отзывов. Подключаешь к нему нейросеть — она сама читает новые отзывы и вопросы покупателей и публикует ответы. Можно настроить, чтобы автоматически уходили ответы на четыре и пять звёзд, а сложные отзывы приходили тебе на проверку.</w:t>
+        <w:t>Четвёртое — Wildberries. У него есть официальный API для вопросов и чата с покупателями. Подключаешь нейросеть — и она сама отвечает про размер, сроки доставки и состав, опираясь на карточку товара и в твоём стиле. Только пропиши ей правила площадки: не уводить покупателя в другие мессенджеры и не просить контакты — за это WB штрафует на двадцать пять тысяч.</w:t>
       </w:r>
     </w:p>
     <w:p>
@@ -213,7 +213,7 @@
           <w:i/>
           <w:color w:val="6E6E6E"/>
         </w:rPr>
-        <w:t>Факты проверены 8 октября 2026: WhatsApp Business MCP от Meta (бета, с 15 сентября 2026); WhatsApp в России заблокирован с февраля 2026 (работает только через VPN); у Авито есть API с мессенджером и отзывами; у Wildberries — официальный API вопросов и отзывов (feedbacks-api, ответы публикуются методом /feedbacks/answer, токен действует 180 дней; при подозрительной активности WB может ограничить доступ к API); ManyChat — шаг с ChatGPT в сценариях по ключевому слову; Telegram Business — подключение бота к личному аккаунту. Цифры лайков у первых референсов — по данным Meta AI, мы их не перепроверяли.</w:t>
+        <w:t>Факты проверены 8 октября 2026: WhatsApp Business MCP от Meta (бета, с 15 сентября 2026); WhatsApp в России заблокирован с февраля 2026 (работает только через VPN); у Авито есть API с мессенджером и отзывами; у Wildberries — официальный API вопросов, отзывов и чатов с покупателями; правила чата: ответ до 10 дней, без односложных ответов, нельзя уводить покупателя на другие площадки и обмениваться контактами, штраф за нарушение — 25 000 ₽; ManyChat — шаг с ChatGPT в сценариях по ключевому слову; Telegram Business — подключение бота к личному аккаунту. Цифры лайков у первых референсов — по данным Meta AI, мы их не перепроверяли.</w:t>
       </w:r>
     </w:p>
     <w:p>

</xml_diff>